<commit_message>
user login with JWT and spring security is done, Authenticate requests using the JWT token from login process and already test that user is being authenticated or not.....
</commit_message>
<xml_diff>
--- a/Modules.docx
+++ b/Modules.docx
@@ -638,6 +638,13 @@
           <w:szCs w:val="36"/>
         </w:rPr>
       </w:pPr>
+      <w:r>
+        <w:rPr>
+          <w:sz w:val="36"/>
+          <w:szCs w:val="36"/>
+        </w:rPr>
+        <w:t>The website will have users who can buy array of products in different quantities. It will hold the inventory of stock and allow user to make orders to ship to their address.</w:t>
+      </w:r>
     </w:p>
     <w:sectPr>
       <w:pgSz w:w="11906" w:h="16838"/>

</xml_diff>